<commit_message>
Rebuild syllabus and Đợt 0–10 exercises on SKU1 formula of 24/09/2026
Add the 22-ingredient formula (roles, INCI corrections, allowed and
forbidden claims) to the syllabus and Đợt 0 Product Truth Sheet, align
positioning, proof, assets, hooks and evidence log in Đợt 2–10, fill
ingredient placeholders in the 30 TikTok contents, and drop the company
name from page footers.

Co-Authored-By: Claude Opus 5.5 <noreply@anthropic.com>
Claude-Session: https://claude.ai/code/session_01RCHR5nifryaMfRHokNNBvc
</commit_message>
<xml_diff>
--- a/DS CORPORATION/TÀI LIỆU THAM KHẢO/MARKETING ROADMAP/30_Content_TikTok_U_Oil_Dosies_Care.docx
+++ b/DS CORPORATION/TÀI LIỆU THAM KHẢO/MARKETING ROADMAP/30_Content_TikTok_U_Oil_Dosies_Care.docx
@@ -8204,7 +8204,7 @@
                 <w:sz w:val="18"/>
                 <w:szCs w:val="18"/>
               </w:rPr>
-              <w:t xml:space="preserve">4. Bỏ qua bước nhũ hóa. Hãy thoa dầu gội lên tóc còn khô trước, massage đến khi chuyển màu trắng sữa rồi mới xả.</w:t>
+              <w:t xml:space="preserve">4. Bỏ qua bước nhũ hóa. Hãy thoa dầu gội lên tóc còn khô trước, massage cho dầu gội "bắt" lấy lớp dầu ủ rồi mới thêm nước và xả.</w:t>
             </w:r>
           </w:p>
           <w:p>
@@ -8627,7 +8627,7 @@
                 <w:sz w:val="18"/>
                 <w:szCs w:val="18"/>
               </w:rPr>
-              <w:t xml:space="preserve">3. Khi hỗn hợp chuyển sang màu trắng đục như sữa, đó là lúc dầu đã được nhũ hóa.</w:t>
+              <w:t xml:space="preserve">3. Thêm chút nước, hỗn hợp chuyển trắng đục như sữa: đó là lúc dầu gội đã nhũ hóa lớp dầu, xả là trôi.</w:t>
             </w:r>
           </w:p>
           <w:p>
@@ -10954,7 +10954,7 @@
                 <w:sz w:val="18"/>
                 <w:szCs w:val="18"/>
               </w:rPr>
-              <w:t xml:space="preserve">3. Dầu nền là loại mỏng nhẹ, lan nhanh trên da đầu, kết hợp các loại dầu và chiết xuất thực vật [điền nhóm thành phần chính theo INCI in trên hộp].</w:t>
+              <w:t xml:space="preserve">3. Nền là ester và alkane mỏng nhẹ, lan nhanh trên da đầu, kết hợp 9 dầu thực vật, Bakuchiol và 7 tinh dầu. Massage sẽ thấy mát lạnh: đó là tinh dầu bạc hà.</w:t>
             </w:r>
           </w:p>
           <w:p>
@@ -11936,67 +11936,67 @@
                 <w:sz w:val="18"/>
                 <w:szCs w:val="18"/>
               </w:rPr>
-              <w:t xml:space="preserve">1. Phần lớn chai là dầu nền mỏng nhẹ [điền tên INCI] giúp dầu lan đều và tạo cảm giác nhẹ.</w:t>
-            </w:r>
-          </w:p>
-          <w:p>
-            <w:pPr>
-              <w:spacing w:after="40" w:line="264"/>
-            </w:pPr>
-            <w:r>
-              <w:rPr>
-                <w:rFonts w:ascii="Arial" w:cs="Arial" w:eastAsia="Arial" w:hAnsi="Arial"/>
-                <w:b w:val="false"/>
-                <w:bCs w:val="false"/>
-                <w:sz w:val="18"/>
-                <w:szCs w:val="18"/>
-              </w:rPr>
-              <w:t xml:space="preserve">2. Nhóm dầu thực vật [điền tên] giúp tóc mềm hơn.</w:t>
-            </w:r>
-          </w:p>
-          <w:p>
-            <w:pPr>
-              <w:spacing w:after="40" w:line="264"/>
-            </w:pPr>
-            <w:r>
-              <w:rPr>
-                <w:rFonts w:ascii="Arial" w:cs="Arial" w:eastAsia="Arial" w:hAnsi="Arial"/>
-                <w:b w:val="false"/>
-                <w:bCs w:val="false"/>
-                <w:sz w:val="18"/>
-                <w:szCs w:val="18"/>
-              </w:rPr>
-              <w:t xml:space="preserve">3. Nhóm chiết xuất [điền tên], với vai trò đúng như hồ sơ công bố của sản phẩm.</w:t>
-            </w:r>
-          </w:p>
-          <w:p>
-            <w:pPr>
-              <w:spacing w:after="40" w:line="264"/>
-            </w:pPr>
-            <w:r>
-              <w:rPr>
-                <w:rFonts w:ascii="Arial" w:cs="Arial" w:eastAsia="Arial" w:hAnsi="Arial"/>
-                <w:b w:val="false"/>
-                <w:bCs w:val="false"/>
-                <w:sz w:val="18"/>
-                <w:szCs w:val="18"/>
-              </w:rPr>
-              <w:t xml:space="preserve">4. Tinh dầu và hương [điền tên] tạo mùi thư giãn. Nếu da bạn nhạy cảm với tinh dầu, hãy thử trước trên một vùng nhỏ.</w:t>
-            </w:r>
-          </w:p>
-          <w:p>
-            <w:pPr>
-              <w:spacing w:after="40" w:line="264"/>
-            </w:pPr>
-            <w:r>
-              <w:rPr>
-                <w:rFonts w:ascii="Arial" w:cs="Arial" w:eastAsia="Arial" w:hAnsi="Arial"/>
-                <w:b w:val="false"/>
-                <w:bCs w:val="false"/>
-                <w:sz w:val="18"/>
-                <w:szCs w:val="18"/>
-              </w:rPr>
-              <w:t xml:space="preserve">5. Những thứ không có trong công thức: [chỉ ghi khi đúng với INCI, ví dụ "không silicone"].</w:t>
+              <w:t xml:space="preserve">1. Đứng đầu bảng là Caprylic/Capric Triglyceride và C15-19 Alkane: hai chất nền mỏng nhẹ giúp sản phẩm lan đều, không nặng tóc.</w:t>
+            </w:r>
+          </w:p>
+          <w:p>
+            <w:pPr>
+              <w:spacing w:after="40" w:line="264"/>
+            </w:pPr>
+            <w:r>
+              <w:rPr>
+                <w:rFonts w:ascii="Arial" w:cs="Arial" w:eastAsia="Arial" w:hAnsi="Arial"/>
+                <w:b w:val="false"/>
+                <w:bCs w:val="false"/>
+                <w:sz w:val="18"/>
+                <w:szCs w:val="18"/>
+              </w:rPr>
+              <w:t xml:space="preserve">2. 9 dầu thực vật: jojoba, hạt nho, cám gạo, argan, hướng dương, amla, sachi, neem, chùm ngây, giúp tóc mềm hơn sau khi gội.</w:t>
+            </w:r>
+          </w:p>
+          <w:p>
+            <w:pPr>
+              <w:spacing w:after="40" w:line="264"/>
+            </w:pPr>
+            <w:r>
+              <w:rPr>
+                <w:rFonts w:ascii="Arial" w:cs="Arial" w:eastAsia="Arial" w:hAnsi="Arial"/>
+                <w:b w:val="false"/>
+                <w:bCs w:val="false"/>
+                <w:sz w:val="18"/>
+                <w:szCs w:val="18"/>
+              </w:rPr>
+              <w:t xml:space="preserve">3. Bakuchiol, Bisabolol và 2 dạng vitamin E; vitamin E còn giữ cho dầu không bị ôi.</w:t>
+            </w:r>
+          </w:p>
+          <w:p>
+            <w:pPr>
+              <w:spacing w:after="40" w:line="264"/>
+            </w:pPr>
+            <w:r>
+              <w:rPr>
+                <w:rFonts w:ascii="Arial" w:cs="Arial" w:eastAsia="Arial" w:hAnsi="Arial"/>
+                <w:b w:val="false"/>
+                <w:bCs w:val="false"/>
+                <w:sz w:val="18"/>
+                <w:szCs w:val="18"/>
+              </w:rPr>
+              <w:t xml:space="preserve">4. 7 tinh dầu: bưởi da xanh, hương thảo, gừng, nghệ, bạc hà, tràm trà, oải hương tạo mùi và cảm giác mát. Chúng có mặt để tạo hương, không phải để "trị" gì. Da nhạy cảm với tinh dầu thì thử sau tai 24 giờ trước.</w:t>
+            </w:r>
+          </w:p>
+          <w:p>
+            <w:pPr>
+              <w:spacing w:after="40" w:line="264"/>
+            </w:pPr>
+            <w:r>
+              <w:rPr>
+                <w:rFonts w:ascii="Arial" w:cs="Arial" w:eastAsia="Arial" w:hAnsi="Arial"/>
+                <w:b w:val="false"/>
+                <w:bCs w:val="false"/>
+                <w:sz w:val="18"/>
+                <w:szCs w:val="18"/>
+              </w:rPr>
+              <w:t xml:space="preserve">5. Những thứ không có: nước, silicone, paraben, hương liệu tổng hợp. Và cũng không có chất nhũ hóa, nên khi gội nhớ thoa sữa gội lên tóc khô trước.</w:t>
             </w:r>
           </w:p>
         </w:tc>
@@ -18456,7 +18456,7 @@
         <w:sz w:val="16"/>
         <w:szCs w:val="16"/>
       </w:rPr>
-      <w:t xml:space="preserve">DS Corporation · Nội bộ · Trang </w:t>
+      <w:t xml:space="preserve">Dosie's Care · Trang </w:t>
     </w:r>
     <w:r>
       <w:rPr>

</xml_diff>